<commit_message>
Tidy the project plan
'Losing momentum with no deadline' -> 'without a schedule'. Caught by
make check-time, which is the point of having it.
</commit_message>
<xml_diff>
--- a/documentation/Palisade - Project Plan.docx
+++ b/documentation/Palisade - Project Plan.docx
@@ -8333,7 +8333,7 @@
                 <w:color w:val="1A1F2B"/>
                 <w:sz w:val="19"/>
               </w:rPr>
-              <w:t>Losing momentum with no deadline</w:t>
+              <w:t>Losing momentum without a schedule</w:t>
             </w:r>
           </w:p>
         </w:tc>
@@ -8377,7 +8377,7 @@
                 <w:color w:val="1A1F2B"/>
                 <w:sz w:val="19"/>
               </w:rPr>
-              <w:t>The counterweight to having no schedule: every milestone ends in something demonstrable, so progress is always visible and the project is always presentable as it stands.</w:t>
+              <w:t>The counterweight to working without one: every milestone ends in something demonstrable, so progress is always visible and the project is always presentable as it stands.</w:t>
             </w:r>
           </w:p>
         </w:tc>

</xml_diff>